<commit_message>
🔄 QAYTA YARATILDI: Ikkinchi va yuqori darajali tenglamalar sistemasi
- Yangi PDF asosida qayta tahlil qilindi
- 25 ta masala to'liq formatlandi
- OMML format, jingalak qavs { bilan
- Javoblar: (x; y) juftliklar
- Balans: A=7, B=6, C=6, D=6
- Professional matematik format
- Generator yangilandi: ikkinchi_yuqori_sistemalar_v2.py
</commit_message>
<xml_diff>
--- a/Ikkinchi_Yuqori_Darajali_Sistemalar_Test.docx
+++ b/Ikkinchi_Yuqori_Darajali_Sistemalar_Test.docx
@@ -71,7 +71,7 @@
       </w:r>
       <m:oMath>
         <m:r xmlns:m="http://schemas.openxmlformats.org/officeDocument/2006/math">
-          <m:t xml:space="preserve">(0; 6); (6; 0)</m:t>
+          <m:t xml:space="preserve">(−2; −4); (−4; −2)</m:t>
         </m:r>
       </m:oMath>
     </w:p>
@@ -122,17 +122,17 @@
       </w:r>
       <m:oMath>
         <m:r xmlns:m="http://schemas.openxmlformats.org/officeDocument/2006/math">
+          <m:t xml:space="preserve">(4; 4)</m:t>
+        </m:r>
+      </m:oMath>
+    </w:p>
+    <w:p>
+      <w:r>
+        <w:t xml:space="preserve">B) </w:t>
+      </w:r>
+      <m:oMath>
+        <m:r xmlns:m="http://schemas.openxmlformats.org/officeDocument/2006/math">
           <m:t xml:space="preserve">(1; 7); (7; 1)</m:t>
-        </m:r>
-      </m:oMath>
-    </w:p>
-    <w:p>
-      <w:r>
-        <w:t xml:space="preserve">B) </w:t>
-      </w:r>
-      <m:oMath>
-        <m:r xmlns:m="http://schemas.openxmlformats.org/officeDocument/2006/math">
-          <m:t xml:space="preserve">(4; 4)</m:t>
         </m:r>
       </m:oMath>
     </w:p>
@@ -433,27 +433,27 @@
       </w:r>
       <m:oMath>
         <m:r xmlns:m="http://schemas.openxmlformats.org/officeDocument/2006/math">
+          <m:t xml:space="preserve">(12; 4); (−6; −14)</m:t>
+        </m:r>
+      </m:oMath>
+    </w:p>
+    <w:p>
+      <w:r>
+        <w:t xml:space="preserve">B) </w:t>
+      </w:r>
+      <m:oMath>
+        <m:r xmlns:m="http://schemas.openxmlformats.org/officeDocument/2006/math">
+          <m:t xml:space="preserve">(9; 1); (−7; −15)</m:t>
+        </m:r>
+      </m:oMath>
+    </w:p>
+    <w:p>
+      <w:r>
+        <w:t xml:space="preserve">C) </w:t>
+      </w:r>
+      <m:oMath>
+        <m:r xmlns:m="http://schemas.openxmlformats.org/officeDocument/2006/math">
           <m:t xml:space="preserve">(11; 3); (−9; −17)</m:t>
-        </m:r>
-      </m:oMath>
-    </w:p>
-    <w:p>
-      <w:r>
-        <w:t xml:space="preserve">B) </w:t>
-      </w:r>
-      <m:oMath>
-        <m:r xmlns:m="http://schemas.openxmlformats.org/officeDocument/2006/math">
-          <m:t xml:space="preserve">(9; 1); (−7; −15)</m:t>
-        </m:r>
-      </m:oMath>
-    </w:p>
-    <w:p>
-      <w:r>
-        <w:t xml:space="preserve">C) </w:t>
-      </w:r>
-      <m:oMath>
-        <m:r xmlns:m="http://schemas.openxmlformats.org/officeDocument/2006/math">
-          <m:t xml:space="preserve">(12; 4); (−6; −14)</m:t>
         </m:r>
       </m:oMath>
     </w:p>
@@ -639,7 +639,7 @@
       </w:r>
       <m:oMath>
         <m:r xmlns:m="http://schemas.openxmlformats.org/officeDocument/2006/math">
-          <m:t xml:space="preserve">(3; 0)</m:t>
+          <m:t xml:space="preserve">(7; 4)</m:t>
         </m:r>
       </m:oMath>
     </w:p>
@@ -1369,7 +1369,7 @@
           </m:dPr>
           <m:e>
             <m:r xmlns:m="http://schemas.openxmlformats.org/officeDocument/2006/math">
-              <m:t xml:space="preserve">x + y = 3</m:t>
+              <m:t xml:space="preserve">x − y = 6</m:t>
             </m:r>
           </m:e>
           <m:e>
@@ -1386,7 +1386,7 @@
               </m:sup>
             </m:sSup>
             <m:r xmlns:m="http://schemas.openxmlformats.org/officeDocument/2006/math">
-              <m:t xml:space="preserve"> + xy − </m:t>
+              <m:t xml:space="preserve"> + </m:t>
             </m:r>
             <m:sSup xmlns:m="http://schemas.openxmlformats.org/officeDocument/2006/math">
               <m:e>
@@ -1401,7 +1401,7 @@
               </m:sup>
             </m:sSup>
             <m:r xmlns:m="http://schemas.openxmlformats.org/officeDocument/2006/math">
-              <m:t xml:space="preserve"> = 5</m:t>
+              <m:t xml:space="preserve"> + 2xy = 16</m:t>
             </m:r>
           </m:e>
         </m:d>
@@ -1413,7 +1413,7 @@
       </w:r>
       <m:oMath>
         <m:r xmlns:m="http://schemas.openxmlformats.org/officeDocument/2006/math">
-          <m:t xml:space="preserve">(2; 1)</m:t>
+          <m:t xml:space="preserve">(4; −2); (−2; −8)</m:t>
         </m:r>
       </m:oMath>
     </w:p>
@@ -1423,7 +1423,7 @@
       </w:r>
       <m:oMath>
         <m:r xmlns:m="http://schemas.openxmlformats.org/officeDocument/2006/math">
-          <m:t xml:space="preserve">(2.5; 0.5)</m:t>
+          <m:t xml:space="preserve">(5; −1); (−1; −7)</m:t>
         </m:r>
       </m:oMath>
     </w:p>
@@ -1433,7 +1433,7 @@
       </w:r>
       <m:oMath>
         <m:r xmlns:m="http://schemas.openxmlformats.org/officeDocument/2006/math">
-          <m:t xml:space="preserve">(3; 0)</m:t>
+          <m:t xml:space="preserve">(6; 0); (0; −6)</m:t>
         </m:r>
       </m:oMath>
     </w:p>
@@ -1443,7 +1443,7 @@
       </w:r>
       <m:oMath>
         <m:r xmlns:m="http://schemas.openxmlformats.org/officeDocument/2006/math">
-          <m:t xml:space="preserve">(1.5; 1.5)</m:t>
+          <m:t xml:space="preserve">(7; 1); (1; −5)</m:t>
         </m:r>
       </m:oMath>
     </w:p>
@@ -1521,7 +1521,7 @@
       </w:r>
       <m:oMath>
         <m:r xmlns:m="http://schemas.openxmlformats.org/officeDocument/2006/math">
-          <m:t xml:space="preserve">(4; −3); (−4; −11)</m:t>
+          <m:t xml:space="preserve">(8; 1); (1; −6)</m:t>
         </m:r>
       </m:oMath>
     </w:p>
@@ -1604,7 +1604,7 @@
       </w:r>
       <m:oMath>
         <m:r xmlns:m="http://schemas.openxmlformats.org/officeDocument/2006/math">
-          <m:t xml:space="preserve">(1; 7); (−9; −3)</m:t>
+          <m:t xml:space="preserve">(5; 11); (−5; 1)</m:t>
         </m:r>
       </m:oMath>
     </w:p>
@@ -1677,7 +1677,7 @@
       </w:r>
       <m:oMath>
         <m:r xmlns:m="http://schemas.openxmlformats.org/officeDocument/2006/math">
-          <m:t xml:space="preserve">(−2; −4); (8; 26)</m:t>
+          <m:t xml:space="preserve">(2; 8); (4; 14)</m:t>
         </m:r>
       </m:oMath>
     </w:p>
@@ -1793,7 +1793,7 @@
       </w:r>
       <m:oMath>
         <m:r xmlns:m="http://schemas.openxmlformats.org/officeDocument/2006/math">
-          <m:t xml:space="preserve">(−1; −1); (6; 2.5)</m:t>
+          <m:t xml:space="preserve">(3; 1); (5; 2)</m:t>
         </m:r>
       </m:oMath>
     </w:p>
@@ -2252,7 +2252,7 @@
       </w:r>
       <m:oMath>
         <m:r xmlns:m="http://schemas.openxmlformats.org/officeDocument/2006/math">
-          <m:t xml:space="preserve">(0; −3); (4; 9)</m:t>
+          <m:t xml:space="preserve">(−1; −6); (4; 9)</m:t>
         </m:r>
       </m:oMath>
     </w:p>

</xml_diff>